<commit_message>
docs(idts-100): finalize mentor-ready SAP490 pack
</commit_message>
<xml_diff>
--- a/docs/ba/brd/brd.en.docx
+++ b/docs/ba/brd/brd.en.docx
@@ -45,7 +45,7 @@
         <w:jc w:val="center"/>
       </w:pPr>
       <w:r>
-        <w:t>Status: Draft v1.5</w:t>
+        <w:t>Status: Draft v1.6</w:t>
       </w:r>
     </w:p>
     <w:p>
@@ -53,7 +53,7 @@
         <w:jc w:val="center"/>
       </w:pPr>
       <w:r>
-        <w:t>Last updated: 2026-07-22</w:t>
+        <w:t>Last updated: 2026-07-24</w:t>
       </w:r>
     </w:p>
     <w:p>
@@ -818,6 +818,110 @@
                 <w:sz w:val="18"/>
               </w:rPr>
               <w:t>Aligned the mentor-review baseline with implemented authentication, shared QA data/storage, asynchronous email delivery, and human-reviewed AI audit behavior.</w:t>
+            </w:r>
+          </w:p>
+        </w:tc>
+        <w:tc>
+          <w:tcPr>
+            <w:tcW w:type="dxa" w:w="1662"/>
+            <w:vAlign w:val="center"/>
+          </w:tcPr>
+          <w:p>
+            <w:r/>
+            <w:r>
+              <w:rPr>
+                <w:rFonts w:ascii="Arial" w:hAnsi="Arial"/>
+                <w:b w:val="0"/>
+                <w:sz w:val="18"/>
+              </w:rPr>
+              <w:t>Draft</w:t>
+            </w:r>
+          </w:p>
+        </w:tc>
+      </w:tr>
+      <w:tr>
+        <w:tc>
+          <w:tcPr>
+            <w:tcW w:type="dxa" w:w="1662"/>
+            <w:vAlign w:val="center"/>
+          </w:tcPr>
+          <w:p>
+            <w:r/>
+            <w:r>
+              <w:rPr>
+                <w:rFonts w:ascii="Arial" w:hAnsi="Arial"/>
+                <w:b w:val="0"/>
+                <w:sz w:val="18"/>
+              </w:rPr>
+              <w:t>v1.6</w:t>
+            </w:r>
+          </w:p>
+        </w:tc>
+        <w:tc>
+          <w:tcPr>
+            <w:tcW w:type="dxa" w:w="1662"/>
+            <w:vAlign w:val="center"/>
+          </w:tcPr>
+          <w:p>
+            <w:r/>
+            <w:r>
+              <w:rPr>
+                <w:rFonts w:ascii="Arial" w:hAnsi="Arial"/>
+                <w:b w:val="0"/>
+                <w:sz w:val="18"/>
+              </w:rPr>
+              <w:t>2026-07-24</w:t>
+            </w:r>
+          </w:p>
+        </w:tc>
+        <w:tc>
+          <w:tcPr>
+            <w:tcW w:type="dxa" w:w="1662"/>
+            <w:vAlign w:val="center"/>
+          </w:tcPr>
+          <w:p>
+            <w:r/>
+            <w:r>
+              <w:rPr>
+                <w:rFonts w:ascii="Arial" w:hAnsi="Arial"/>
+                <w:b w:val="0"/>
+                <w:sz w:val="18"/>
+              </w:rPr>
+              <w:t>IDTS Project Team</w:t>
+            </w:r>
+          </w:p>
+        </w:tc>
+        <w:tc>
+          <w:tcPr>
+            <w:tcW w:type="dxa" w:w="1662"/>
+            <w:vAlign w:val="center"/>
+          </w:tcPr>
+          <w:p>
+            <w:r/>
+            <w:r>
+              <w:rPr>
+                <w:rFonts w:ascii="Arial" w:hAnsi="Arial"/>
+                <w:b w:val="0"/>
+                <w:sz w:val="18"/>
+              </w:rPr>
+              <w:t>Mentor / Supervisor</w:t>
+            </w:r>
+          </w:p>
+        </w:tc>
+        <w:tc>
+          <w:tcPr>
+            <w:tcW w:type="dxa" w:w="1662"/>
+            <w:vAlign w:val="center"/>
+          </w:tcPr>
+          <w:p>
+            <w:r/>
+            <w:r>
+              <w:rPr>
+                <w:rFonts w:ascii="Arial" w:hAnsi="Arial"/>
+                <w:b w:val="0"/>
+                <w:sz w:val="18"/>
+              </w:rPr>
+              <w:t>Clarified that the current AI audit stores source-linked suggestions in PENDING; no public action yet persists ACCEPTED, REJECTED, or IGNORED.</w:t>
             </w:r>
           </w:p>
         </w:tc>
@@ -2931,7 +3035,7 @@
       <w:r>
         <w:drawing>
           <wp:inline xmlns:a="http://schemas.openxmlformats.org/drawingml/2006/main" xmlns:pic="http://schemas.openxmlformats.org/drawingml/2006/picture">
-            <wp:extent cx="5760720" cy="7127421"/>
+            <wp:extent cx="5760720" cy="6241585"/>
             <wp:docPr id="3" name="Picture 3"/>
             <wp:cNvGraphicFramePr>
               <a:graphicFrameLocks noChangeAspect="1"/>
@@ -2952,7 +3056,7 @@
                   <pic:spPr>
                     <a:xfrm>
                       <a:off x="0" y="0"/>
-                      <a:ext cx="5760720" cy="7127421"/>
+                      <a:ext cx="5760720" cy="6241585"/>
                     </a:xfrm>
                     <a:prstGeom prst="rect"/>
                   </pic:spPr>
@@ -4420,7 +4524,7 @@
     </w:p>
     <w:p>
       <w:r>
-        <w:t>Important events create in-app notification records and, when applicable, separate email-delivery work items in NotificationDeliveries. Email processing is asynchronous: a provider failure must not roll back the original bug action. Optional AI output is stored as a normalized AiSuggestions review/audit record, never as an autonomous decision. Live-provider acceptance still depends on approved private configuration and evidence; this BRD does not claim unverified delivery.</w:t>
+        <w:t>Important events create in-app notification records and, when applicable, separate email-delivery work items in NotificationDeliveries. Email processing is asynchronous: a provider failure must not roll back the original bug action. Optional source-linked AI output is stored as a normalized AiSuggestions review/audit record in PENDING, never as an autonomous decision. The current service exposes no public action that persists ACCEPTED, REJECTED, or IGNORED; a user may only review the output and then separately invoke an ordinary authorized CAP action. Live-provider acceptance still depends on approved private configuration and evidence; this BRD does not claim unverified delivery.</w:t>
       </w:r>
     </w:p>
     <w:p>

</xml_diff>